<commit_message>
deliver(cg): refresh the 1008 submission package
</commit_message>
<xml_diff>
--- a/1008/submission_1008/Response_to_Reviewers_1008.docx
+++ b/1008/submission_1008/Response_to_Reviewers_1008.docx
@@ -94,6 +94,14 @@
         <w:pStyle w:val="BodyText"/>
       </w:pPr>
       <w:r>
+        <w:t xml:space="preserve">A later four-object color-pathway development audit further distinguishes a control channel from a repair. Perturbing the global appearance embedding shifted chroma in the registered directions on all four selected objects. The Fresh B input-only audit found that stored embeddings matched neither compared source-conditioning reconstruction within 0.03 for 150/150 inputs, but did not establish that this discrepancy causes the artifacts. The C1 chroma anchor met its numeric gate (mean unseen-view ΔFG-CIEDE2000 −1.5602; 95% CI [−2.2621, −0.6299]) but failed locked visual review: one case showed no clear gain, while the other retained mismatch and showed a faint cyan/blue rim. B2’s selected raw-source embedding substitution also failed its numeric gate (mean object-level change +0.1729; 95% CI [−0.2044, +0.6810]; one of four improved) and showed no clear visual correction. No independent Fresh B repair validation was performed. These development findings identify a controllable appearance pathway and a plausible cache-alignment contributor, not a validated color fix or complete root cause.</w:t>
+      </w:r>
+    </w:p>
+    <w:p>
+      <w:pPr>
+        <w:pStyle w:val="BodyText"/>
+      </w:pPr>
+      <w:r>
         <w:rPr>
           <w:bCs/>
           <w:b/>
@@ -294,7 +302,33 @@
         <w:t xml:space="preserve"> </w:t>
       </w:r>
       <w:r>
-        <w:t xml:space="preserve">We retain the negative FAC controlled re-examination reported in the first-round 01549 revision, including its seven-configuration results and untrained control. The stated study used roughly 6×10³ trainable controller parameters, AdamW with a peak learning rate of 10⁻⁴, 100 warm-up steps, 2,000 training steps, a reported 1,706-object training pool, and a paired 300-object evaluation. The reported trained configurations were 1.10–2.94 dB below TCAS on FG-PSNR; the untrained 12-object C3-envelope control had ΔFG-PSNR −0.18 dB (95% CI [−0.42,+0.05]).</w:t>
+        <w:t xml:space="preserve">We retain the negative FAC controlled re-examination reported in the first-round 01549 revision, including its seven-configuration results and untrained control. The stated study used roughly 6×10³ trainable controller parameters, AdamW with a peak learning rate of</w:t>
+      </w:r>
+      <w:r>
+        <w:t xml:space="preserve"> </w:t>
+      </w:r>
+      <m:oMath>
+        <m:sSup>
+          <m:e>
+            <m:r>
+              <m:t>10</m:t>
+            </m:r>
+          </m:e>
+          <m:sup>
+            <m:r>
+              <m:rPr>
+                <m:sty m:val="p"/>
+              </m:rPr>
+              <m:t>−</m:t>
+            </m:r>
+            <m:r>
+              <m:t>4</m:t>
+            </m:r>
+          </m:sup>
+        </m:sSup>
+      </m:oMath>
+      <w:r>
+        <w:t xml:space="preserve">, 100 warm-up steps, 2,000 training steps, a reported 1,706-object training pool, and a paired 300-object evaluation. The reported trained configurations were 1.10–2.94 dB below TCAS on FG-PSNR; the untrained 12-object C3-envelope control had ΔFG-PSNR −0.18 dB (95% CI [−0.42,+0.05]).</w:t>
       </w:r>
     </w:p>
     <w:p>

</xml_diff>

<commit_message>
Revise C&G 1008 manuscript and review package
</commit_message>
<xml_diff>
--- a/1008/submission_1008/Response_to_Reviewers_1008.docx
+++ b/1008/submission_1008/Response_to_Reviewers_1008.docx
@@ -31,54 +31,43 @@
     </w:p>
     <w:p>
       <w:pPr>
-        <w:pStyle w:val="BodyText"/>
-      </w:pPr>
-      <w:r>
-        <w:t xml:space="preserve">Dear Editor and Reviewers,</w:t>
-      </w:r>
-    </w:p>
-    <w:p>
-      <w:pPr>
-        <w:pStyle w:val="BodyText"/>
-      </w:pPr>
-      <w:r>
-        <w:t xml:space="preserve">We thank you for the careful assessment. This revision keeps Timestep-Conditioned Adapter Scaling (TCAS) as the method and narrows its claims to the evidence available. We now describe the actual Fresh C figures and controls, correct the stage-placement result, distinguish applied scale from schedule shape, and replace an invalid interaction-bootstrap inference with the available exploratory object-cluster robust Wald analysis. The revisions and remaining limits are detailed below.</w:t>
-      </w:r>
-    </w:p>
-    <w:bookmarkStart w:id="25" w:name="reviewer-1"/>
-    <w:p>
-      <w:pPr>
-        <w:pStyle w:val="Heading2"/>
-      </w:pPr>
-      <w:r>
-        <w:t xml:space="preserve">Reviewer 1</w:t>
-      </w:r>
-    </w:p>
-    <w:bookmarkStart w:id="20" w:name="X494d0e66d38227e498c1d845c1aeeb590543031"/>
-    <w:p>
-      <w:pPr>
-        <w:pStyle w:val="Heading3"/>
-      </w:pPr>
-      <w:r>
-        <w:t xml:space="preserve">Comment 1 — Visual artifacts, full-object comparisons, and 3D fidelity</w:t>
-      </w:r>
-    </w:p>
-    <w:p>
-      <w:pPr>
-        <w:pStyle w:val="FirstParagraph"/>
+        <w:pStyle w:val="BlockText"/>
       </w:pPr>
       <w:r>
         <w:rPr>
           <w:bCs/>
           <w:b/>
         </w:rPr>
-        <w:t xml:space="preserve">Response.</w:t>
-      </w:r>
-      <w:r>
-        <w:t xml:space="preserve"> </w:t>
-      </w:r>
-      <w:r>
-        <w:t xml:space="preserve">We agree that the earlier panels did not make it easy to compare the complete object and the same local detail. Figure 4 now shows Reference, GFL, GFH, and C3 for one C3–GFL endpoint-favorable case and one adverse case. Figure 5 preserves the fixed-scale comparison and adds a separate Generic Linear counterexample. Each panel pairs a full target-view context with one shared pixel ROI; the displayed RGB outputs are not independently adjusted. The full six-view, seven-condition comparison—including No Adapter, LLH, and Generic Linear—remains in Supplementary Figure S1. The selected panels illustrate outcomes and do not estimate artifact prevalence or texture fidelity.</w:t>
+        <w:t xml:space="preserve">Author verification required before submission.</w:t>
+      </w:r>
+      <w:r>
+        <w:t xml:space="preserve"> </w:t>
+      </w:r>
+      <w:r>
+        <w:t xml:space="preserve">The retained</w:t>
+      </w:r>
+      <w:r>
+        <w:t xml:space="preserve"> </w:t>
+      </w:r>
+      <w:r>
+        <w:rPr>
+          <w:rStyle w:val="VerbatimChar"/>
+        </w:rPr>
+        <w:t xml:space="preserve">CAG-D-26-00962-reviews.pdf</w:t>
+      </w:r>
+      <w:r>
+        <w:t xml:space="preserve"> </w:t>
+      </w:r>
+      <w:r>
+        <w:t xml:space="preserve">is labeled as initial-submission reviews, and no exact second-round export or editor email is available in this workspace. The round mapping is author-confirmed in the retained issue map; the headings below paraphrase that map and are not represented as verbatim reviewer quotations. Compare them with the editor’s original second-round decision before finalizing this response.</w:t>
+      </w:r>
+    </w:p>
+    <w:p>
+      <w:pPr>
+        <w:pStyle w:val="FirstParagraph"/>
+      </w:pPr>
+      <w:r>
+        <w:t xml:space="preserve">Dear Editor and Reviewers,</w:t>
       </w:r>
     </w:p>
     <w:p>
@@ -86,41 +75,85 @@
         <w:pStyle w:val="BodyText"/>
       </w:pPr>
       <w:r>
-        <w:t xml:space="preserve">The unmodified native-default adapter path is not represented by Fresh C’s No Adapter condition: No Adapter sets scale to zero, while an unset scale field applies the geometry residual without a scale multiplier. Fresh C has no separate output for that native-default path, so this comparison remains unresolved. The historical N=20 unseen-view check uses unlit base color and has mixed endpoint directions. The attempted Fresh C bake did not pass its native-input gate; no valid Fresh C bake, seam, or PBR result is claimed. We also cannot verify whether the reviewer-facing portal exposed the supplied video.</w:t>
-      </w:r>
-    </w:p>
-    <w:p>
-      <w:pPr>
-        <w:pStyle w:val="BodyText"/>
-      </w:pPr>
-      <w:r>
-        <w:t xml:space="preserve">A later four-object color-pathway development audit further distinguishes a control channel from a repair. Perturbing the global appearance embedding shifted chroma in the registered directions on all four selected objects. The Fresh B input-only audit found that stored embeddings matched neither compared source-conditioning reconstruction within 0.03 for 150/150 inputs, but did not establish that this discrepancy causes the artifacts. The C1 chroma anchor met its numeric gate (mean unseen-view ΔFG-CIEDE2000 −1.5602; 95% CI [−2.2621, −0.6299]) but failed locked visual review: one case showed no clear gain, while the other retained mismatch and showed a faint cyan/blue rim. B2’s selected raw-source embedding substitution also failed its numeric gate (mean object-level change +0.1729; 95% CI [−0.2044, +0.6810]; one of four improved) and showed no clear visual correction. No independent Fresh B repair validation was performed. These development findings identify a controllable appearance pathway and a plausible cache-alignment contributor, not a validated color fix or complete root cause.</w:t>
-      </w:r>
-    </w:p>
-    <w:p>
-      <w:pPr>
-        <w:pStyle w:val="BodyText"/>
-      </w:pPr>
-      <w:r>
-        <w:t xml:space="preserve">We also completed a separate, failure-enriched 26-object color diagnosis using paired No Adapter, GFL, and LLH outputs with six unique target views per object. GFL reduced mean reference-relative foreground CIEDE2000 versus No Adapter by 19.65 (95% paired object-bootstrap CI [−26.37, −13.25]; 24/26 objects), but the two original Figure 4 cases retained visible pink or purple hue shifts across all three conditions. LLH minus GFL increased mean CIEDE2000 by 3.58 (95% CI [+0.46, +6.71]) and reduced local gradient and high-frequency measures, consistent with detail suppression rather than a color correction. A decoded RGB snapshot showed the hue shift before baking; a ground-truth VAE round trip did not reproduce the same direction or magnitude in the selected case. Because this diagnostic subset was failure-enriched, it is not an independent population confirmation. The complete color-generation cause remains unidentified, and no repair is validated.</w:t>
-      </w:r>
-    </w:p>
-    <w:p>
-      <w:pPr>
-        <w:pStyle w:val="BodyText"/>
+        <w:t xml:space="preserve">We thank you for the careful assessment. This revision keeps Timestep-Conditioned Adapter Scaling (TCAS) as the method and narrows its claims to the evidence available. We now describe the actual Fresh C figures and controls, correct the stage-placement result, distinguish applied scale from schedule shape, and replace an invalid interaction-bootstrap inference with the available exploratory object-cluster robust Wald analysis. The revisions and remaining limits are detailed below.</w:t>
+      </w:r>
+    </w:p>
+    <w:bookmarkStart w:id="25" w:name="reviewer-1"/>
+    <w:p>
+      <w:pPr>
+        <w:pStyle w:val="Heading2"/>
+      </w:pPr>
+      <w:r>
+        <w:t xml:space="preserve">Reviewer 1</w:t>
+      </w:r>
+    </w:p>
+    <w:bookmarkStart w:id="20" w:name="X494d0e66d38227e498c1d845c1aeeb590543031"/>
+    <w:p>
+      <w:pPr>
+        <w:pStyle w:val="Heading3"/>
+      </w:pPr>
+      <w:r>
+        <w:t xml:space="preserve">Comment 1 — Visual artifacts, full-object comparisons, and 3D fidelity</w:t>
+      </w:r>
+    </w:p>
+    <w:p>
+      <w:pPr>
+        <w:pStyle w:val="FirstParagraph"/>
       </w:pPr>
       <w:r>
         <w:rPr>
           <w:bCs/>
           <w:b/>
         </w:rPr>
+        <w:t xml:space="preserve">Response.</w:t>
+      </w:r>
+      <w:r>
+        <w:t xml:space="preserve"> </w:t>
+      </w:r>
+      <w:r>
+        <w:t xml:space="preserve">We agree that the earlier panels did not make it easy to compare the complete object and the same local detail. Figure 7 now shows reference, GFL, GFH, and C3 for a C3–GFL endpoint-favorable case and an adverse case, with each full target-view context paired with the same pixel ROI. Figure 4 preserves the fixed-scale comparison and adds a separate Generic Linear counterexample; its RGB outputs are not independently adjusted. Figure 6 reproduces the historical pink/purple failure from the submitted 01549 Figure 4, but its original panel-level object/run mapping is unavailable, so we use it only to document the historical failure. Supplementary Figure S1 shows two selected examples across six views and seven conditions, including No Adapter, LLH, and Generic Linear. These outcome-selected examples do not estimate artifact prevalence or texture fidelity.</w:t>
+      </w:r>
+    </w:p>
+    <w:p>
+      <w:pPr>
+        <w:pStyle w:val="BodyText"/>
+      </w:pPr>
+      <w:r>
+        <w:t xml:space="preserve">The unmodified native-default adapter path is not represented by Fresh C’s No Adapter condition: No Adapter sets scale to zero, while an unset scale field applies the geometry residual without a scale multiplier. Fresh C has no separate output for that native-default path, so this comparison remains unresolved. The historical N=20 unseen-view check uses unlit base color and has mixed endpoint directions. The attempted Fresh C bake did not pass its native-input gate; no valid Fresh C bake, seam, or PBR result is claimed. We also cannot verify whether the reviewer-facing portal exposed the supplied video.</w:t>
+      </w:r>
+    </w:p>
+    <w:p>
+      <w:pPr>
+        <w:pStyle w:val="BodyText"/>
+      </w:pPr>
+      <w:r>
+        <w:t xml:space="preserve">A later four-object color-pathway development audit further distinguishes a control channel from a repair. Perturbing the global appearance embedding shifted chroma in the registered directions on all four selected objects. The Fresh B input-only audit found that stored embeddings matched neither compared source-conditioning reconstruction within 0.03 for 150/150 inputs, but did not establish that this discrepancy causes the artifacts. The C1 chroma anchor met its numeric gate (mean unseen-view ΔFG-CIEDE2000 −1.5602; 95% CI [−2.2621, −0.6299]) but failed locked visual review: one case showed no clear gain, while the other retained mismatch and showed a faint cyan/blue rim. B2’s selected raw-source embedding substitution also failed its numeric gate (mean object-level change +0.1729; 95% CI [−0.2044, +0.6810]; one of four improved) and showed no clear visual correction. No independent Fresh B repair validation was performed. These development findings identify a controllable appearance pathway and a plausible cache-alignment contributor, not a validated color fix or complete root cause.</w:t>
+      </w:r>
+    </w:p>
+    <w:p>
+      <w:pPr>
+        <w:pStyle w:val="BodyText"/>
+      </w:pPr>
+      <w:r>
+        <w:t xml:space="preserve">We also completed a separate, failure-enriched 26-object color diagnosis using paired No Adapter, GFL, and LLH outputs with six unique target views per object. GFL reduced mean reference-relative foreground CIEDE2000 versus No Adapter by 19.65 (95% paired object-bootstrap CI [−26.37, −13.25]; 24/26 objects), but the two cases shown in the submitted 01549 Figure 4 retained visible pink or purple hue shifts across all three conditions. LLH minus GFL increased mean CIEDE2000 by 3.58 (95% CI [+0.46, +6.71]) and reduced local gradient and high-frequency measures, consistent with detail suppression rather than a color correction. A decoded RGB snapshot showed the hue shift before baking; a ground-truth VAE round trip did not reproduce the same direction or magnitude in the selected case. Because this diagnostic subset was failure-enriched, it is not an independent population confirmation. The complete color-generation cause remains unidentified, and no repair is validated.</w:t>
+      </w:r>
+    </w:p>
+    <w:p>
+      <w:pPr>
+        <w:pStyle w:val="BodyText"/>
+      </w:pPr>
+      <w:r>
+        <w:rPr>
+          <w:bCs/>
+          <w:b/>
+        </w:rPr>
         <w:t xml:space="preserve">Location.</w:t>
       </w:r>
       <w:r>
         <w:t xml:space="preserve"> </w:t>
       </w:r>
       <w:r>
-        <w:t xml:space="preserve">Main manuscript: Figures 4–5 (pp. 11–12), stage/applicability analysis (p. 8), and Limitations (pp. 8–9). Supplement: Figure S1 (p. 1), Sections S6–S8 (pp. 9–10), and the paired color diagnosis in S13 (p. 13). The figure-source and ROI manifest records image hashes and crop coordinates.</w:t>
+        <w:t xml:space="preserve">Main manuscript: Figure 4 (p. 13), the archival color-shift Figure 6 (p. 15), full-object Figure 7 (p. 16), the color results and Table 7 (pp. 8–9), and Limitations (p. 11). Supplement: selected six-view/seven-condition examples in Figure S1 (p. 10), Sections S6–S8 (pp. 9–10), and the paired color diagnosis in S13 (p. 13). The Fresh C figure-source and ROI manifest records image hashes and crop coordinates.</w:t>
       </w:r>
     </w:p>
     <w:bookmarkEnd w:id="20"/>
@@ -190,7 +223,7 @@
         <w:t xml:space="preserve"> </w:t>
       </w:r>
       <w:r>
-        <w:t xml:space="preserve">Main manuscript: Methods (pp. 4–5), Tables 3–4 (p. 7), stage analysis (p. 8), and Limitations (pp. 8–9). Supplement: S2 (p. 2), S3 (pp. 3–5), S5 (pp. 6–8), S8 (p. 10), and S9 (p. 11).</w:t>
+        <w:t xml:space="preserve">Main manuscript: Methods (pp. 3–5), Tables 3–4 (p. 8), temporal-placement analysis (pp. 7–9), and Limitations (p. 11). Supplement: S2 (p. 2), S3 (pp. 3–5), S4–S5 (pp. 6–8), S8 (p. 10), and S9 (p. 11).</w:t>
       </w:r>
     </w:p>
     <w:bookmarkEnd w:id="21"/>
@@ -236,7 +269,7 @@
         <w:t xml:space="preserve"> </w:t>
       </w:r>
       <w:r>
-        <w:t xml:space="preserve">Main manuscript: metric definitions (p. 3), Figures 4–5 (pp. 11–12), preference Table 5 (p. 7), and Limitations (pp. 8–9). Supplement: S2 (p. 2), S7 (p. 9), and the retrospective complexity analysis in S12 (pp. 12–13).</w:t>
+        <w:t xml:space="preserve">Main manuscript: metric definitions (p. 3), Figures 4–7 (pp. 13–16), preference Table 9 (p. 10), and Limitations (p. 11). Supplement: S2 (p. 2), S7 (pp. 9–10), and the retrospective complexity analysis in S12 (p. 12).</w:t>
       </w:r>
     </w:p>
     <w:bookmarkEnd w:id="22"/>
@@ -282,7 +315,7 @@
         <w:t xml:space="preserve"> </w:t>
       </w:r>
       <w:r>
-        <w:t xml:space="preserve">Main manuscript: Table 4 and endpoint interpretation (p. 7). Supplement: Section S2 (p. 2).</w:t>
+        <w:t xml:space="preserve">Main manuscript: Table 4 and endpoint interpretation (p. 8). Supplement: Section S2 (p. 2).</w:t>
       </w:r>
     </w:p>
     <w:bookmarkEnd w:id="23"/>
@@ -362,7 +395,7 @@
         <w:t xml:space="preserve"> </w:t>
       </w:r>
       <w:r>
-        <w:t xml:space="preserve">Main manuscript: FAC discussion (p. 7) and Limitations (pp. 8–9). Supplement: Section S11 and Table S13 (pp. 11–12).</w:t>
+        <w:t xml:space="preserve">Main manuscript: FAC discussion (p. 10) and Limitations (p. 11). Supplement: Section S11 and Table S13 (pp. 11–12).</w:t>
       </w:r>
     </w:p>
     <w:bookmarkEnd w:id="24"/>
@@ -426,7 +459,7 @@
         <w:t xml:space="preserve"> </w:t>
       </w:r>
       <w:r>
-        <w:t xml:space="preserve">Main manuscript: Introduction and Related Work (pp. 1–3), TCAS Method (pp. 3–5), Tables 3–4 (p. 7), stage analysis (p. 8), and Limitations (pp. 8–9). Supplement: S3 (pp. 3–5), S4–S5 (pp. 6–8), S9 (p. 11), and the retrospective complexity boundary in S12 (pp. 12–13).</w:t>
+        <w:t xml:space="preserve">Main manuscript: Introduction and Related Work (pp. 1–2), TCAS Method (pp. 3–4), Tables 3–8 (pp. 8–10), stage analysis (pp. 7–9), and Limitations/Conclusion (p. 11). Supplement: S3 (pp. 3–5), S4–S5 (pp. 6–8), S9 (p. 11), and the retrospective complexity boundary in S12 (p. 12).</w:t>
       </w:r>
     </w:p>
     <w:bookmarkEnd w:id="26"/>
@@ -472,7 +505,7 @@
         <w:t xml:space="preserve"> </w:t>
       </w:r>
       <w:r>
-        <w:t xml:space="preserve">Main manuscript: TCAS Method (pp. 3–4) and development subsection/Table 2/Figure 6 (p. 6). Supplement: historical development diagnostics in S10 (pp. 9–10).</w:t>
+        <w:t xml:space="preserve">Main manuscript: TCAS Method (pp. 3–4), development subsection/Table 2 (p. 7), and Figure 5 (p. 14). Supplement: historical development diagnostics in S10/Table S12 (p. 11).</w:t>
       </w:r>
     </w:p>
     <w:bookmarkEnd w:id="27"/>
@@ -552,7 +585,7 @@
         <w:t xml:space="preserve"> </w:t>
       </w:r>
       <w:r>
-        <w:t xml:space="preserve">Main manuscript: stage/applicability analysis (p. 8) and Limitations (pp. 8–9). Supplement: Section S5 (pp. 6–8).</w:t>
+        <w:t xml:space="preserve">Main manuscript: Cross-Interface Evaluation/Table 8 (p. 10) and Limitations (p. 11). Supplement: Section S5 (pp. 6–8).</w:t>
       </w:r>
     </w:p>
     <w:bookmarkEnd w:id="28"/>

</xml_diff>

<commit_message>
docs(cg): complete A3b correction and refresh review package
</commit_message>
<xml_diff>
--- a/1008/submission_1008/Response_to_Reviewers_1008.docx
+++ b/1008/submission_1008/Response_to_Reviewers_1008.docx
@@ -111,7 +111,7 @@
         <w:t xml:space="preserve"> </w:t>
       </w:r>
       <w:r>
-        <w:t xml:space="preserve">We agree that the earlier panels did not make it easy to compare the complete object and the same local detail. Figure 7 now shows reference, GFL, GFH, and C3 for a C3–GFL endpoint-favorable case and an adverse case, with each full target-view context paired with the same pixel ROI. Figure 4 preserves the fixed-scale comparison and adds a separate Generic Linear counterexample; its RGB outputs are not independently adjusted. Figure 6 reproduces the historical pink/purple failure from the submitted 01549 Figure 4, but its original panel-level object/run mapping is unavailable, so we use it only to document the historical failure. Supplementary Figure S1 shows two selected examples across six views and seven conditions, including No Adapter, LLH, and Generic Linear. These outcome-selected examples do not estimate artifact prevalence or texture fidelity.</w:t>
+        <w:t xml:space="preserve">We agree that the submitted panels did not establish appearance across complete objects or after texture projection. Figure 5 now pairs fixed-scale and Generic Linear comparisons with a shared target view and ROI; Figure 7 shows full-object context and the same ROI for favorable and adverse C3–GFL cases. Figure 6 is a rights-cleared, hash-traced Fresh C example that was not selected for color; it is not a reconstruction of the two unmapped legacy pink-shift cases. Supplementary Figure S1 retains the six-view, seven-condition panel.</w:t>
       </w:r>
     </w:p>
     <w:p>
@@ -119,7 +119,7 @@
         <w:pStyle w:val="BodyText"/>
       </w:pPr>
       <w:r>
-        <w:t xml:space="preserve">The unmodified native-default adapter path is not represented by Fresh C’s No Adapter condition: No Adapter sets scale to zero, while an unset scale field applies the geometry residual without a scale multiplier. Fresh C has no separate output for that native-default path, so this comparison remains unresolved. The historical N=20 unseen-view check uses unlit base color and has mixed endpoint directions. The attempted Fresh C bake did not pass its native-input gate; no valid Fresh C bake, seam, or PBR result is claimed. We also cannot verify whether the reviewer-facing portal exposed the supplied video.</w:t>
+        <w:t xml:space="preserve">Fresh C’s No Adapter condition sets adapter scale to zero; it is not the unset-scale native-default path. The attempted Fresh C bake failed its native-input gate, so we report no valid Fresh C baked mesh, seam, or PBR result. We also could not verify reviewer-side access to the supplementary video.</w:t>
       </w:r>
     </w:p>
     <w:p>
@@ -127,7 +127,7 @@
         <w:pStyle w:val="BodyText"/>
       </w:pPr>
       <w:r>
-        <w:t xml:space="preserve">A later four-object color-pathway development audit further distinguishes a control channel from a repair. Perturbing the global appearance embedding shifted chroma in the registered directions on all four selected objects. The Fresh B input-only audit found that stored embeddings matched neither compared source-conditioning reconstruction within 0.03 for 150/150 inputs, but did not establish that this discrepancy causes the artifacts. The C1 chroma anchor met its numeric gate (mean unseen-view ΔFG-CIEDE2000 −1.5602; 95% CI [−2.2621, −0.6299]) but failed locked visual review: one case showed no clear gain, while the other retained mismatch and showed a faint cyan/blue rim. B2’s selected raw-source embedding substitution also failed its numeric gate (mean object-level change +0.1729; 95% CI [−0.2044, +0.6810]; one of four improved) and showed no clear visual correction. No independent Fresh B repair validation was performed. These development findings identify a controllable appearance pathway and a plausible cache-alignment contributor, not a validated color fix or complete root cause.</w:t>
+        <w:t xml:space="preserve">The paired, failure-enriched 26-object color diagnosis shows that GFL reduces mean foreground CIEDE2000 relative to No Adapter by 19.65 (95% CI [−26.37, −13.25]; 24/26 objects), while pink/purple shifts remain in two legacy cases. LLH−GFL increases CIEDE2000 by 3.58 and lowers local gradient and high-frequency measures, consistent with detail suppression rather than a color repair. The additional appearance-pathway and P0 checks do not identify the full cause or validate a repair. These selected cases do not estimate prevalence, texture fidelity, or baked 3D/PBR quality.</w:t>
       </w:r>
     </w:p>
     <w:p>
@@ -135,14 +135,6 @@
         <w:pStyle w:val="BodyText"/>
       </w:pPr>
       <w:r>
-        <w:t xml:space="preserve">We also completed a separate, failure-enriched 26-object color diagnosis using paired No Adapter, GFL, and LLH outputs with six unique target views per object. GFL reduced mean reference-relative foreground CIEDE2000 versus No Adapter by 19.65 (95% paired object-bootstrap CI [−26.37, −13.25]; 24/26 objects), but the two cases shown in the submitted 01549 Figure 4 retained visible pink or purple hue shifts across all three conditions. LLH minus GFL increased mean CIEDE2000 by 3.58 (95% CI [+0.46, +6.71]) and reduced local gradient and high-frequency measures, consistent with detail suppression rather than a color correction. A decoded RGB snapshot showed the hue shift before baking; a ground-truth VAE round trip did not reproduce the same direction or magnitude in the selected case. Because this diagnostic subset was failure-enriched, it is not an independent population confirmation. The complete color-generation cause remains unidentified, and no repair is validated.</w:t>
-      </w:r>
-    </w:p>
-    <w:p>
-      <w:pPr>
-        <w:pStyle w:val="BodyText"/>
-      </w:pPr>
-      <w:r>
         <w:rPr>
           <w:bCs/>
           <w:b/>
@@ -153,7 +145,7 @@
         <w:t xml:space="preserve"> </w:t>
       </w:r>
       <w:r>
-        <w:t xml:space="preserve">Main manuscript: Figure 4 (p. 13), the archival color-shift Figure 6 (p. 15), full-object Figure 7 (p. 16), the color results and Table 7 (pp. 8–9), and Limitations (p. 11). Supplement: selected six-view/seven-condition examples in Figure S1 (p. 10), Sections S6–S8 (pp. 9–10), and the paired color diagnosis in S13 (p. 13). The Fresh C figure-source and ROI manifest records image hashes and crop coordinates.</w:t>
+        <w:t xml:space="preserve">Main manuscript: Figure 5 (p. 9), color results/Table 7 (p. 11), Figure 6 (p. 12), Figure 7 (p. 13), Limitations (p. 15). Supplement: Figure S1 (p. 11), S6–S8 (pp. 10–11), S13/Table S17 (p. 15), and figure attribution/provenance in Table S1.</w:t>
       </w:r>
     </w:p>
     <w:bookmarkEnd w:id="20"/>
@@ -181,7 +173,7 @@
         <w:t xml:space="preserve"> </w:t>
       </w:r>
       <w:r>
-        <w:t xml:space="preserve">The earlier 01549 revision reported a probe-disjoint 276-object schedule-transfer analysis using a separate v2 strong-residual, per-layer-capped adapter. We retain that first-round result in Supplementary Section S9; it does not substitute for a matched comparison of the current main adapter.</w:t>
+        <w:t xml:space="preserve">Fresh C evaluates the current adapter on 300 frozen object IDs disjoint from both the earlier 24-object schedule-development probe and the original 300-object evaluation. The primary run and same-cohort addendum share the checkpoint, runner, inputs, target views, metrics, and per-object seed policy; the integrity gates pass for 1,200/1,200 primary rows and 600/600 addendum rows. The registered C3−GFL FG-PSNR difference is +0.522352 dB (95% object-bootstrap CI [+0.404160, +0.640669]).</w:t>
       </w:r>
     </w:p>
     <w:p>
@@ -189,7 +181,7 @@
         <w:pStyle w:val="BodyText"/>
       </w:pPr>
       <w:r>
-        <w:t xml:space="preserve">Fresh C supplies a matched held-out image-space comparison on 300 UIDs disjoint from the earlier 24-object schedule-development probe and the original 300-object evaluation. Its primary four-condition run and same-cohort Generic Linear/LLH addendum share a frozen checkpoint, runner source, cohort, inputs, views, metric implementation, and per-object seed policy. The integrity gates pass for 1,200/1,200 primary rows and 600/600 addendum rows. The registered C3−GFL FG-PSNR difference is +0.522352 dB (95% object-bootstrap CI [+0.404160,+0.640669]).</w:t>
+        <w:t xml:space="preserve">We report the counter-results alongside it: GFH and Generic Linear have more favorable cohort means than C3 on all four displayed endpoints. C3 and GFL also differ in applied deep/middle scale sums (82.5 versus 62.5), so this is not a timing-only comparison. Fresh C is a controlled retraining, not the historical 01549 checkpoint or a numerical reproduction of its +0.96 dB estimate. The older strict-276 and Core-7 analyses remain separately labeled retrospective diagnostics; neither replaces this matched current-adapter comparison.</w:t>
       </w:r>
     </w:p>
     <w:p>
@@ -197,22 +189,6 @@
         <w:pStyle w:val="BodyText"/>
       </w:pPr>
       <w:r>
-        <w:t xml:space="preserve">We report the counter-results alongside this positive contrast: GFH and Generic Linear have more favorable cohort means than C3 on all four displayed endpoints. We also clarify that the comparison does not isolate schedule timing. The 50-step applied deep and middle scale sums are 82.5 each for C3 and 62.5 each for GFL; both have a shallow sum of 40 after the native 0.8 cap. Fresh C therefore supports the recorded C3 intervention relative to GFL under this wrapper, not a timing-only effect.</w:t>
-      </w:r>
-    </w:p>
-    <w:p>
-      <w:pPr>
-        <w:pStyle w:val="BodyText"/>
-      </w:pPr>
-      <w:r>
-        <w:t xml:space="preserve">The Fresh C checkpoint is a controlled retraining; it is not presented as the unavailable historical 01549 main-table weight artifact or as a numerical reproduction of the submitted +0.96 dB estimate. The historical v1 main-table and v2 Table 9/FAC adapter identities remain separate. Core-7 is retained only as a retrospective Supplement diagnostic: it reports C3−GFH +0.725229 dB Full-view PSNR and −1.214235 dB FG-PSNR, but does not establish one shared runner or complete input identity. Fresh B and A3b results are also retained as sensitivity evidence rather than preregistered confirmation because the lock text’s stated freeze time (2026-10-05 08:40 UTC) predates the earliest preserved commit containing that file (2026-10-06 00:52 UTC), so the retained history does not authenticate pre-run availability.</w:t>
-      </w:r>
-    </w:p>
-    <w:p>
-      <w:pPr>
-        <w:pStyle w:val="BodyText"/>
-      </w:pPr>
-      <w:r>
         <w:rPr>
           <w:bCs/>
           <w:b/>
@@ -223,7 +199,7 @@
         <w:t xml:space="preserve"> </w:t>
       </w:r>
       <w:r>
-        <w:t xml:space="preserve">Main manuscript: Methods (pp. 3–5), Tables 3–4 (p. 8), temporal-placement analysis (pp. 7–9), and Limitations (p. 11). Supplement: S2 (p. 2), S3 (pp. 3–5), S4–S5 (pp. 6–8), S8 (p. 10), and S9 (p. 11).</w:t>
+        <w:t xml:space="preserve">Main manuscript: Methods (pp. 3–5), Tables 3–4 (p. 8), stage placement (pp. 10–11), Limitations (p. 15). Supplement: S2 (p. 2), S3 (pp. 3–5), S4–S5 (pp. 6–10), S8 (p. 11), and S9 (p. 12).</w:t>
       </w:r>
     </w:p>
     <w:bookmarkEnd w:id="21"/>
@@ -251,7 +227,7 @@
         <w:t xml:space="preserve"> </w:t>
       </w:r>
       <w:r>
-        <w:t xml:space="preserve">We agree that larger gradients, RGB variation, or Laplacian variance do not establish faithful texture reproduction. The manuscript treats these as variation diagnostics only and does not use them to claim fidelity. Fresh C reports image-space agreement endpoints, not a validated texture-fidelity measure. A separate retrospective analysis on FRESH_CONFIRM_300 found a 9/10 plus-one-corrected Holm association family between LLH−GFL image-space deltas and ground-truth descriptors; its Laplacian-variance strata range from a +4.14 dB FG-PSNR mean (92% LLH-favorable) in Q1 to slightly negative means in Q3 and Q4. The only non-rejecting test was FG-LPIPS versus foreground coverage (Holm-adjusted p=0.0508). This is a noncausal, post-outcome sensitivity result, not a fidelity measure, a selector, or evidence for C3. The earlier 3AFC study remains a separate subjective-preference result for its original three conditions; it is not Fresh C evidence, a reference-fidelity measure, or a 3D-quality result.</w:t>
+        <w:t xml:space="preserve">We agree that larger gradients, RGB variation, or Laplacian variance do not establish faithful texture reproduction. The revision defines these as variation diagnostics and does not use them as fidelity endpoints. Fresh C reports image-space agreement, not validated texture fidelity. The 01549 3AFC study is retained only as a subjective preference result for its original conditions. The retrospective texture-complexity analysis in Supplement S12 is noncausal and is not used as a fidelity measure, schedule selector, or result for C3.</w:t>
       </w:r>
     </w:p>
     <w:p>
@@ -269,7 +245,7 @@
         <w:t xml:space="preserve"> </w:t>
       </w:r>
       <w:r>
-        <w:t xml:space="preserve">Main manuscript: metric definitions (p. 3), Figures 4–7 (pp. 13–16), preference Table 9 (p. 10), and Limitations (p. 11). Supplement: S2 (p. 2), S7 (pp. 9–10), and the retrospective complexity analysis in S12 (p. 12).</w:t>
+        <w:t xml:space="preserve">Main: metrics (p. 3); Figures 4–7 (pp. 8–13); Table 9 (p. 14); Limitations (p. 15). Supplement: S2 (p. 2), S7 (p. 11), S12 (p. 14).</w:t>
       </w:r>
     </w:p>
     <w:bookmarkEnd w:id="22"/>
@@ -343,33 +319,7 @@
         <w:t xml:space="preserve"> </w:t>
       </w:r>
       <w:r>
-        <w:t xml:space="preserve">We retain the negative FAC controlled re-examination reported in the first-round 01549 revision, including its seven-configuration results and untrained control. The stated study used roughly 6×10³ trainable controller parameters, AdamW with a peak learning rate of</w:t>
-      </w:r>
-      <w:r>
-        <w:t xml:space="preserve"> </w:t>
-      </w:r>
-      <m:oMath>
-        <m:sSup>
-          <m:e>
-            <m:r>
-              <m:t>10</m:t>
-            </m:r>
-          </m:e>
-          <m:sup>
-            <m:r>
-              <m:rPr>
-                <m:sty m:val="p"/>
-              </m:rPr>
-              <m:t>−</m:t>
-            </m:r>
-            <m:r>
-              <m:t>4</m:t>
-            </m:r>
-          </m:sup>
-        </m:sSup>
-      </m:oMath>
-      <w:r>
-        <w:t xml:space="preserve">, 100 warm-up steps, 2,000 training steps, a reported 1,706-object training pool, and a paired 300-object evaluation. The reported trained configurations were 1.10–2.94 dB below TCAS on FG-PSNR; the untrained 12-object C3-envelope control had ΔFG-PSNR −0.18 dB (95% CI [−0.42,+0.05]).</w:t>
+        <w:t xml:space="preserve">We retain the seven-configuration FAC negative re-examination and separate untrained control as results reported in the first-round 01549 revision, not as new 1008 experiments. The reported trained configurations were 1.10–2.94 dB below TCAS on FG-PSNR; the untrained 12-object control reported ΔFG-PSNR −0.18 dB (95% CI [−0.42, +0.05]). We disclose that the recovered configuration references a 1,200-object list rather than the reported 1,706-object pool, and that no run-bound manifest links the training seed, outputs, and runtime. We make no claim of a full replay or public code release.</w:t>
       </w:r>
     </w:p>
     <w:p>
@@ -377,14 +327,6 @@
         <w:pStyle w:val="BodyText"/>
       </w:pPr>
       <w:r>
-        <w:t xml:space="preserve">We disclose that the recovered configuration points to a 1,200-object list rather than the 1,706-object pool stated in 01549, and the available archive does not bind the training seed, outputs, and runtime in a single run manifest. These remain previously reported results, not a new 1008 experiment. The earlier reviewer encouraged code release; we do not claim a public release.</w:t>
-      </w:r>
-    </w:p>
-    <w:p>
-      <w:pPr>
-        <w:pStyle w:val="BodyText"/>
-      </w:pPr>
-      <w:r>
         <w:rPr>
           <w:bCs/>
           <w:b/>
@@ -395,7 +337,7 @@
         <w:t xml:space="preserve"> </w:t>
       </w:r>
       <w:r>
-        <w:t xml:space="preserve">Main manuscript: FAC discussion (p. 10) and Limitations (p. 11). Supplement: Section S11 and Table S13 (pp. 11–12).</w:t>
+        <w:t xml:space="preserve">Main manuscript: FAC discussion (p. 14) and Limitations (p. 15). Supplement: S11/Table S15 (p. 13).</w:t>
       </w:r>
     </w:p>
     <w:bookmarkEnd w:id="24"/>
@@ -433,7 +375,7 @@
         <w:t xml:space="preserve"> </w:t>
       </w:r>
       <w:r>
-        <w:t xml:space="preserve">The contribution is a task-specific study of how geometry-residual strength can be controlled and measured inside a multi-view texturing system. TCAS makes the requested intervention explicit, while the execution analysis distinguishes requested scale, wrapper-applied scale under native caps, and the resulting residual magnitude. Fresh C then compares that intervention with fixed and scheduled alternatives under matched inputs and object-paired image-space endpoints. This combination provides reproducible evidence about what the control changes in this pipeline and about where interpretation fails: GFH and Generic Linear have more favorable means than C3 on all four displayed cohort endpoints, and C3/GFL differ in applied deep- and middle-layer scale sums, so their contrast does not isolate timing alone. We therefore retain TCAS as the named task-specific intervention and empirical comparison framework, without claiming that piecewise scheduling itself is a new general algorithm or that C3 is optimal.</w:t>
+        <w:t xml:space="preserve">We agree that timestep- or layer-dependent scheduling is not new by itself. The revision states this directly and positions TCAS as a graphics-task-specific intervention on the existing GeoTex-Adapter residual path. Its contribution is the operational distinction between requested scale, scale after native caps, and the resulting residual correction, together with paired measurements of fixed and scheduled controls on multi-view texture outputs.</w:t>
       </w:r>
     </w:p>
     <w:p>
@@ -441,7 +383,7 @@
         <w:pStyle w:val="BodyText"/>
       </w:pPr>
       <w:r>
-        <w:t xml:space="preserve">We now compare the scope directly with Scheduled Style Injection (SSI), which studies style-injection schedules across layers and denoising time and also schedules geometry-conditioned ControlNet strength. SSI establishes that schedule design is not new in general. TCAS addresses a different task and residual interface. Its contribution is the operational specification of this intervention, the paired comparison of fixed and scheduled controls, and the resulting account of cap-, dose-, endpoint-, and object-dependent behavior in multi-view texture generation. The stage-placement analysis further shows that temporal L–L–H is favored over C3 on all six formal endpoints in a separate post-inspection follow-up. Fresh B’s lock chronology is not authenticated, so those temporal and A3b findings are presented as sensitivity evidence; the retrospective texture-complexity analysis likewise identifies boundaries rather than a schedule selector. These results support an empirical system contribution, not a universal schedule law or a claim that C3 is the overall winner.</w:t>
+        <w:t xml:space="preserve">Fresh C favors C3 over GFL on registered FG-PSNR, but GFH and Generic Linear have stronger means on all four displayed endpoints; C3/GFL also differ in applied deep/middle sums. Post-inspection strict-276 favors L–L–H, but its layer-wise correction summaries are unmatched. We claim neither C3 optimality nor a timing-only effect. SSI prior art is acknowledged; training-free implementation is not offered as the sole novelty argument. Novelty sufficiency remains an editorial judgment.</w:t>
       </w:r>
     </w:p>
     <w:p>
@@ -449,6 +391,37 @@
         <w:pStyle w:val="BodyText"/>
       </w:pPr>
       <w:r>
+        <w:t xml:space="preserve">Re-audit showed that the A3b support calculation and probe-24 calibration used raw</w:t>
+      </w:r>
+      <w:r>
+        <w:t xml:space="preserve"> </w:t>
+      </w:r>
+      <m:oMath>
+        <m:sSub>
+          <m:e>
+            <m:r>
+              <m:t>L</m:t>
+            </m:r>
+          </m:e>
+          <m:sub>
+            <m:r>
+              <m:t>2</m:t>
+            </m:r>
+          </m:sub>
+        </m:sSub>
+      </m:oMath>
+      <w:r>
+        <w:t xml:space="preserve"> </w:t>
+      </w:r>
+      <w:r>
+        <w:t xml:space="preserve">across feature maps of different spatial size; channel counts were not logged. We withdraw their cross-layer support and equal-dose/imbalance interpretations. The fixed A3b values remain as tested settings. Supplementary S3 states this limit; S4 reports per-entry magnitudes descriptively. A3b supports response heterogeneity under those settings, not an equal-dose or dose-independent effect.</w:t>
+      </w:r>
+    </w:p>
+    <w:p>
+      <w:pPr>
+        <w:pStyle w:val="BodyText"/>
+      </w:pPr>
+      <w:r>
         <w:rPr>
           <w:bCs/>
           <w:b/>
@@ -459,7 +432,7 @@
         <w:t xml:space="preserve"> </w:t>
       </w:r>
       <w:r>
-        <w:t xml:space="preserve">Main manuscript: Introduction and Related Work (pp. 1–2), TCAS Method (pp. 3–4), Tables 3–8 (pp. 8–10), stage analysis (pp. 7–9), and Limitations/Conclusion (p. 11). Supplement: S3 (pp. 3–5), S4–S5 (pp. 6–8), S9 (p. 11), and the retrospective complexity boundary in S12 (p. 12).</w:t>
+        <w:t xml:space="preserve">Main manuscript: Introduction/Related Work (pp. 1–2), TCAS Method (pp. 3–5), Tables 3–4 (p. 8), Tables 5–7 (p. 11), Tables 8–9 (p. 14), stage analysis (pp. 10–11), Limitations/Conclusion (p. 15). Supplement: S3 (pp. 3–5), S4–S5 (pp. 6–10), S9 (p. 12), and S12 (p. 14).</w:t>
       </w:r>
     </w:p>
     <w:bookmarkEnd w:id="26"/>
@@ -487,7 +460,7 @@
         <w:t xml:space="preserve"> </w:t>
       </w:r>
       <w:r>
-        <w:t xml:space="preserve">We agree that the CAI proposition and proof did not independently derive C3. We remove CAI’s selector, proposition, proof, and optimality claim. We retain the TCAS residual-injection equation, three-stage profile, C3 definition, and 24-object development record, now identified as historical development evidence rather than a verified ranking or unique optimum. This correction concerns CAI’s rationale and does not remove TCAS.</w:t>
+        <w:t xml:space="preserve">We agree that the CAI proposition and proof formalized an empirically selected profile rather than deriving it independently. We remove the selector, proposition, proof, and optimality claim. TCAS’s residual-injection equation, three-stage profile, C3 definition, and 24-object development record remain, labeled as historical development evidence rather than a verified ranking or unique optimum.</w:t>
       </w:r>
     </w:p>
     <w:p>
@@ -505,7 +478,7 @@
         <w:t xml:space="preserve"> </w:t>
       </w:r>
       <w:r>
-        <w:t xml:space="preserve">Main manuscript: TCAS Method (pp. 3–4), development subsection/Table 2 (p. 7), and Figure 5 (p. 14). Supplement: historical development diagnostics in S10/Table S12 (p. 11).</w:t>
+        <w:t xml:space="preserve">Main manuscript: TCAS Method (pp. 3–5), development Table 2 (p. 7), Figure 4 (p. 8). Supplement: S10 (p. 12) and Table S14 (p. 13).</w:t>
       </w:r>
     </w:p>
     <w:bookmarkEnd w:id="27"/>
@@ -533,7 +506,7 @@
         <w:t xml:space="preserve"> </w:t>
       </w:r>
       <w:r>
-        <w:t xml:space="preserve">We agree that adapter variations within one MVPainter-style family do not establish cross-backbone generalization. The MV-Adapter probe analyzed 98 of 99 planned inputs; the omitted frozen GLB had path geometry but no triangle faces, and no substitute was used. The production additive-residual bootstrap had an invalid null for interaction inference and is not used as evidence.</w:t>
+        <w:t xml:space="preserve">We withdraw the invalid 98/99-probe interaction bootstrap. An exploratory object-cluster Wald reanalysis detected no Holm-adjusted interaction across four metrics (adjusted p-values 0.156–0.868); non-detection is not equivalence.</w:t>
       </w:r>
     </w:p>
     <w:p>
@@ -541,33 +514,7 @@
         <w:pStyle w:val="BodyText"/>
       </w:pPr>
       <w:r>
-        <w:t xml:space="preserve">The post hoc exploratory object-cluster robust Wald reanalysis (8 degrees of freedom) found no interaction surviving Holm correction across four metrics: FG-LPIPS raw p=0.101, Holm p=0.303; PSNR p=0.434, Holm p=0.868; FG-SSIM p=0.039, Holm p=0.156; and CIEDE2000 p=0.862, Holm p=0.862. These results are not proof that interaction is absent or that conditions are equivalent. A separate 76-object MV-Adapter layer-mapping study found mixed metric directions under a budget-neutral</w:t>
-      </w:r>
-      <w:r>
-        <w:t xml:space="preserve"> </w:t>
-      </w:r>
-      <m:oMath>
-        <m:sSup>
-          <m:e>
-            <m:r>
-              <m:t>B</m:t>
-            </m:r>
-          </m:e>
-          <m:sup>
-            <m:r>
-              <m:rPr>
-                <m:sty m:val="p"/>
-              </m:rPr>
-              <m:t>′</m:t>
-            </m:r>
-          </m:sup>
-        </m:sSup>
-      </m:oMath>
-      <w:r>
-        <w:t xml:space="preserve"> </w:t>
-      </w:r>
-      <w:r>
-        <w:t xml:space="preserve">partition; its M3 companion changed both grouping and total nominal residual budget (mean multiplier 0.8065) and was classified as retrospective because the protocol and results first appear in the same preserved commit. The two mapping analyses do not establish a general mapping law or generalize TCAS across backbones. The separate MVDiffusion probe covered 75 objects through a different correspondence-aware interface and produced mixed or negative endpoint results. Because these probes use different conditioning paths and runners, they are interface checks rather than a matched architecture comparison; cross-backbone generalization remains unestablished.</w:t>
+        <w:t xml:space="preserve">The retrospective 76-object MV-Adapter panel adds 228 layer-wise outputs, but scales condition-guider features before UNet injection rather than GeoTex residual corrections. Its results trade endpoints; each temporal contrast has one of six pointwise intervals excluding zero among 30 unadjusted intervals. The three-object wrapper audit matched the existing global runner in 9/9 cases, not the official native-scale path. The 75-object MVDiffusion panel used a compatibility base; a separate native-mirror check matched 1,552 tensors and 12 views for one object, but the panel was not rerun. These interface-specific probes do not establish matched cross-backbone transfer.</w:t>
       </w:r>
     </w:p>
     <w:p>
@@ -585,7 +532,7 @@
         <w:t xml:space="preserve"> </w:t>
       </w:r>
       <w:r>
-        <w:t xml:space="preserve">Main manuscript: Cross-Interface Evaluation/Table 8 (p. 10) and Limitations (p. 11). Supplement: Section S5 (pp. 6–8).</w:t>
+        <w:t xml:space="preserve">Main manuscript: Cross-Interface Evaluation (pp. 13–14; Table 8 p. 14) and Limitations (p. 15). Supplement: S5 (pp. 6–10), Table S10 (p. 9), and Table S11 (pp. 9–10).</w:t>
       </w:r>
     </w:p>
     <w:bookmarkEnd w:id="28"/>

</xml_diff>

<commit_message>
docs(cg): close R1/R2 response and finalize package
</commit_message>
<xml_diff>
--- a/1008/submission_1008/Response_to_Reviewers_1008.docx
+++ b/1008/submission_1008/Response_to_Reviewers_1008.docx
@@ -379,7 +379,7 @@
         <w:t xml:space="preserve"> </w:t>
       </w:r>
       <w:r>
-        <w:t xml:space="preserve">Main manuscript: FAC discussion and Limitations (p. 15). Supplement: S11/Table S16 (p. 14).</w:t>
+        <w:t xml:space="preserve">Main manuscript: FAC discussion (p. 14) and Limitations (p. 15). Supplement: S11/Table S16 (p. 14).</w:t>
       </w:r>
     </w:p>
     <w:bookmarkEnd w:id="24"/>
@@ -429,7 +429,7 @@
         <w:t xml:space="preserve"> </w:t>
       </w:r>
       <w:r>
-        <w:t xml:space="preserve">We agree that timestep- or layer-dependent scheduling is not new by itself. The revision states this directly and positions TCAS as a graphics-task-specific intervention on the existing GeoTex-Adapter residual path. Its contribution is the operational distinction between requested scale, scale after native caps, and the resulting residual correction, together with paired measurements of fixed and scheduled controls on multi-view texture outputs.</w:t>
+        <w:t xml:space="preserve">We agree that schedule selection for an existing adapter has limited algorithmic novelty. ControlNet/T2I-Adapter expose conditioning-strength controls; SSI already schedules layer and denoising axes and geometry-conditioned ControlNet strength. GeoTex in 01549 already supplied a fixed residual multiplier. TCAS reuses it for a three-stage request. Its bounded task-specific contribution is to measure requested values, native-cap applied values, activation-dependent residual corrections, and paired multi-view outcomes. It adds no learned branch or selector; scale values are not common doses across interfaces.</w:t>
       </w:r>
     </w:p>
     <w:p>
@@ -437,7 +437,7 @@
         <w:pStyle w:val="BodyText"/>
       </w:pPr>
       <w:r>
-        <w:t xml:space="preserve">Fresh C favors C3 over GFL on registered FG-PSNR, but GFH and Generic Linear have stronger means on all four displayed endpoints; C3/GFL also differ in applied deep/middle sums. Post-inspection strict-276 favors L–L–H, but its layer-wise correction summaries are unmatched. We claim neither C3 optimality nor a timing-only effect. SSI prior art is acknowledged; training-free implementation is not offered as the sole novelty argument. Novelty sufficiency remains an editorial judgment.</w:t>
+        <w:t xml:space="preserve">Fresh C favors C3 over GFL on registered FG-PSNR, while GFH and Generic Linear have stronger means on all four endpoints; C3/GFL applied deep/middle sums also differ. Post-inspection strict-276 favors L–L–H, but its layer-wise corrections are unmatched. We claim neither C3 optimality nor a timing-only effect. Novelty sufficiency remains an editorial judgment.</w:t>
       </w:r>
     </w:p>
     <w:p>
@@ -445,7 +445,7 @@
         <w:pStyle w:val="BodyText"/>
       </w:pPr>
       <w:r>
-        <w:t xml:space="preserve">Re-audit showed that the A3b support calculation and probe-24 calibration used raw</w:t>
+        <w:t xml:space="preserve">Because A3b’s support calculation and probe-24 calibration compare raw</w:t>
       </w:r>
       <w:r>
         <w:t xml:space="preserve"> </w:t>
@@ -468,7 +468,7 @@
         <w:t xml:space="preserve"> </w:t>
       </w:r>
       <w:r>
-        <w:t xml:space="preserve">across feature maps of different spatial size; channel counts were not logged. We withdraw their cross-layer support and equal-dose/imbalance interpretations. The fixed A3b values remain as tested settings. Supplementary S3 states this limit; S4 reports per-entry magnitudes descriptively. A3b supports response heterogeneity under those settings, not an equal-dose or dose-independent effect.</w:t>
+        <w:t xml:space="preserve">across feature maps of different spatial dimensions (with channel counts unlogged), we withdraw cross-layer support and equal-dose interpretations. Values remain tested settings; S4’s per-entry magnitudes are descriptive. A3b supports response heterogeneity under these settings, not a dose-independent effect.</w:t>
       </w:r>
     </w:p>
     <w:p>
@@ -486,7 +486,7 @@
         <w:t xml:space="preserve"> </w:t>
       </w:r>
       <w:r>
-        <w:t xml:space="preserve">Main manuscript: Introduction/Related Work (pp. 1–2), TCAS Method (pp. 3–5), Tables 3–4 (p. 8), Tables 5–7 (p. 11), Tables 8–9 (p. 14), stage analysis (pp. 10–11), Limitations/Conclusion (p. 15). Supplement: S3 (pp. 3–5), S4–S5 (pp. 6–11), S9/Table S14 (p. 13), and S12 (p. 15).</w:t>
+        <w:t xml:space="preserve">Main: Introduction/Related Work (pp. 1–2), Method (pp. 3–5), results (pp. 8, 11, 14), Limitations (p. 15). Supplement: S3–S5 (pp. 3–11), S9/S14 (p. 13), S12 (p. 15).</w:t>
       </w:r>
     </w:p>
     <w:bookmarkEnd w:id="26"/>
@@ -612,7 +612,7 @@
         </m:r>
       </m:oMath>
       <w:r>
-        <w:t xml:space="preserve">); non-detection is not equivalence. The retrospective 76-object MV-Adapter panel scales condition-guider features rather than GeoTex residual corrections. Its endpoint results are mixed, and each temporal contrast has only one of six unadjusted intervals excluding zero.</w:t>
+        <w:t xml:space="preserve">); non-detection is not equivalence. The 76-object MV-Adapter panel scales condition-guider features before UNet down-block residual injection. MVDiffusion instead interpolates CPBlock outputs; its depth condition is concatenated into the latent and left unscaled. Neither intervention reproduces the GeoTex per-ResNet residual correction. The MV-Adapter endpoint results are mixed, and each temporal contrast has only one of six unadjusted intervals excluding zero.</w:t>
       </w:r>
     </w:p>
     <w:p>
@@ -620,76 +620,7 @@
         <w:pStyle w:val="BodyText"/>
       </w:pPr>
       <w:r>
-        <w:t xml:space="preserve">We rechecked all 525 rows and reproduced the 30 archived MVDiffusion means and intervals as raw A-minus-B; the run generated 12 views and scored six per object. L–LLH minus G–FL CIEDE2000 is</w:t>
-      </w:r>
-      <w:r>
-        <w:t xml:space="preserve"> </w:t>
-      </w:r>
-      <m:oMath>
-        <m:r>
-          <m:rPr>
-            <m:sty m:val="p"/>
-          </m:rPr>
-          <m:t>+</m:t>
-        </m:r>
-        <m:r>
-          <m:t>1.373021</m:t>
-        </m:r>
-      </m:oMath>
-      <w:r>
-        <w:t xml:space="preserve"> </w:t>
-      </w:r>
-      <w:r>
-        <w:t xml:space="preserve">(95% CI [</w:t>
-      </w:r>
-      <m:oMath>
-        <m:r>
-          <m:rPr>
-            <m:sty m:val="p"/>
-          </m:rPr>
-          <m:t>+</m:t>
-        </m:r>
-        <m:r>
-          <m:t>0.418244</m:t>
-        </m:r>
-        <m:r>
-          <m:rPr>
-            <m:sty m:val="p"/>
-          </m:rPr>
-          <m:t>,</m:t>
-        </m:r>
-        <m:r>
-          <m:rPr>
-            <m:sty m:val="p"/>
-          </m:rPr>
-          <m:t>+</m:t>
-        </m:r>
-        <m:r>
-          <m:t>2.374678</m:t>
-        </m:r>
-      </m:oMath>
-      <w:r>
-        <w:t xml:space="preserve">]), indicating higher color error; the archived</w:t>
-      </w:r>
-      <w:r>
-        <w:t xml:space="preserve"> </w:t>
-      </w:r>
-      <m:oMath>
-        <m:r>
-          <m:rPr>
-            <m:sty m:val="p"/>
-          </m:rPr>
-          <m:t>−</m:t>
-        </m:r>
-        <m:r>
-          <m:t>1.373</m:t>
-        </m:r>
-      </m:oMath>
-      <w:r>
-        <w:t xml:space="preserve"> </w:t>
-      </w:r>
-      <w:r>
-        <w:t xml:space="preserve">was improvement-coded. PSNR, FG-SSIM, and Edge-SSIM are lower, while FG-LPIPS is not separated. Among P5’s six endpoints, only FG-LPIPS has an interval that excludes zero, favoring G–LLH; all 30 intervals are pointwise and unadjusted. This compatibility-base panel was not rerun on the native mirror; its separate check covered one object. Table S12 gives the complete results. Neither auxiliary panel establishes matched cross-backbone transfer.</w:t>
+        <w:t xml:space="preserve">Audit of 525 rows reproduced all 30 raw A−B contrasts (12 views generated; six scored). In P1 (L–LLH−G–FL), PSNR −0.453828, FG-SSIM −0.019393, and Edge-SSIM −0.005941 favor G–FL (higher is better); FG-LPIPS +0.002745 is not separated. CIEDE2000 +1.373021 (95% CI [+0.418244,+2.374678]) means worse color error under L–LLH; archived −1.373 was improvement-coded. GT-relative texture error −0.082286 means closer to recorded variation statistics, not greater fidelity. In P5, only FG-LPIPS excludes zero, favoring G–LLH. All intervals are pointwise and unadjusted. The compatibility-base panel was not rerun on the native mirror; its separate check covered one object. Table S12 gives all contrasts. These probes do not establish matched transfer.</w:t>
       </w:r>
     </w:p>
     <w:p>
@@ -707,7 +638,7 @@
         <w:t xml:space="preserve"> </w:t>
       </w:r>
       <w:r>
-        <w:t xml:space="preserve">Main: Cross-Interface Evaluation/Table 8 (pp. 13–14) and Limitations (p. 15). Supplement: S5 (pp. 6–11) and Tables S10–S12 (pp. 10–11).</w:t>
+        <w:t xml:space="preserve">Main: Table 8 (pp. 13–14), Limitations (p. 15); Supplement S5 and Tables S10–S12 (pp. 6–11).</w:t>
       </w:r>
     </w:p>
     <w:bookmarkEnd w:id="28"/>

</xml_diff>